<commit_message>
Show the real app on the site: actual Home, detail, compare and in-depth screens
The hero phone is now the actual Home screen (greeting, crops/livestock
toggle, market pulse, biggest movers and top performers with commodity
pictures), and a new Inside-the-app section shows three more real
screens rebuilt in CSS/SVG so they stay sharp on any display: the
commodity page with its SELL suggestion, transport opportunities on
Compare, and the in-depth candle view with the 7-day average.

Co-Authored-By: Claude Fable 5 <noreply@anthropic.com>
</commit_message>
<xml_diff>
--- a/AgriPulse Zambia.docx
+++ b/AgriPulse Zambia.docx
@@ -1,6 +1,6 @@
 
 <file path=word/document.xml><?xml version="1.0" encoding="utf-8"?>
-<w:document xmlns:wpc="http://schemas.microsoft.com/office/word/2010/wordprocessingCanvas" xmlns:cx="http://schemas.microsoft.com/office/drawing/2014/chartex" xmlns:cx1="http://schemas.microsoft.com/office/drawing/2015/9/8/chartex" xmlns:cx2="http://schemas.microsoft.com/office/drawing/2015/10/21/chartex" xmlns:cx3="http://schemas.microsoft.com/office/drawing/2016/5/9/chartex" xmlns:cx4="http://schemas.microsoft.com/office/drawing/2016/5/10/chartex" xmlns:cx5="http://schemas.microsoft.com/office/drawing/2016/5/11/chartex" xmlns:cx6="http://schemas.microsoft.com/office/drawing/2016/5/12/chartex" xmlns:cx7="http://schemas.microsoft.com/office/drawing/2016/5/13/chartex" xmlns:cx8="http://schemas.microsoft.com/office/drawing/2016/5/14/chartex" xmlns:mc="http://schemas.openxmlformats.org/markup-compatibility/2006" xmlns:aink="http://schemas.microsoft.com/office/drawing/2016/ink" xmlns:am3d="http://schemas.microsoft.com/office/drawing/2017/model3d" xmlns:o="urn:schemas-microsoft-com:office:office" xmlns:oel="http://schemas.microsoft.com/office/2019/extlst" xmlns:r="http://schemas.openxmlformats.org/officeDocument/2006/relationships" xmlns:m="http://schemas.openxmlformats.org/officeDocument/2006/math" xmlns:v="urn:schemas-microsoft-com:vml" xmlns:wp14="http://schemas.microsoft.com/office/word/2010/wordprocessingDrawing" xmlns:wp="http://schemas.openxmlformats.org/drawingml/2006/wordprocessingDrawing" xmlns:w10="urn:schemas-microsoft-com:office:word" xmlns:w="http://schemas.openxmlformats.org/wordprocessingml/2006/main" xmlns:w14="http://schemas.microsoft.com/office/word/2010/wordml" xmlns:w15="http://schemas.microsoft.com/office/word/2012/wordml" xmlns:w16cei="http://schemas.microsoft.com/office/word/2026/wordml/cei" xmlns:w16cex="http://schemas.microsoft.com/office/word/2018/wordml/cex" xmlns:w16cid="http://schemas.microsoft.com/office/word/2016/wordml/cid" xmlns:w16="http://schemas.microsoft.com/office/word/2018/wordml" xmlns:w16du="http://schemas.microsoft.com/office/word/2023/wordml/word16du" xmlns:w16sdtdh="http://schemas.microsoft.com/office/word/2020/wordml/sdtdatahash" xmlns:w16sdtfl="http://schemas.microsoft.com/office/word/2024/wordml/sdtformatlock" xmlns:w16se="http://schemas.microsoft.com/office/word/2015/wordml/symex" xmlns:wpg="http://schemas.microsoft.com/office/word/2010/wordprocessingGroup" xmlns:wpi="http://schemas.microsoft.com/office/word/2010/wordprocessingInk" xmlns:wne="http://schemas.microsoft.com/office/word/2006/wordml" xmlns:wps="http://schemas.microsoft.com/office/word/2010/wordprocessingShape" mc:Ignorable="w14 w15 w16se w16cid w16 w16cex w16sdtdh w16sdtfl w16du wp14">
+<w:document xmlns:wpc="http://schemas.microsoft.com/office/word/2010/wordprocessingCanvas" xmlns:cx="http://schemas.microsoft.com/office/drawing/2014/chartex" xmlns:cx1="http://schemas.microsoft.com/office/drawing/2015/9/8/chartex" xmlns:cx2="http://schemas.microsoft.com/office/drawing/2015/10/21/chartex" xmlns:cx3="http://schemas.microsoft.com/office/drawing/2016/5/9/chartex" xmlns:cx4="http://schemas.microsoft.com/office/drawing/2016/5/10/chartex" xmlns:cx5="http://schemas.microsoft.com/office/drawing/2016/5/11/chartex" xmlns:cx6="http://schemas.microsoft.com/office/drawing/2016/5/12/chartex" xmlns:cx7="http://schemas.microsoft.com/office/drawing/2016/5/13/chartex" xmlns:cx8="http://schemas.microsoft.com/office/drawing/2016/5/14/chartex" xmlns:mc="http://schemas.openxmlformats.org/markup-compatibility/2006" xmlns:aink="http://schemas.microsoft.com/office/drawing/2016/ink" xmlns:am3d="http://schemas.microsoft.com/office/drawing/2017/model3d" xmlns:o="urn:schemas-microsoft-com:office:office" xmlns:oel="http://schemas.microsoft.com/office/2019/extlst" xmlns:r="http://schemas.openxmlformats.org/officeDocument/2006/relationships" xmlns:m="http://schemas.openxmlformats.org/officeDocument/2006/math" xmlns:v="urn:schemas-microsoft-com:vml" xmlns:wp14="http://schemas.microsoft.com/office/word/2010/wordprocessingDrawing" xmlns:wp="http://schemas.openxmlformats.org/drawingml/2006/wordprocessingDrawing" xmlns:w10="urn:schemas-microsoft-com:office:word" xmlns:w="http://schemas.openxmlformats.org/wordprocessingml/2006/main" xmlns:w14="http://schemas.microsoft.com/office/word/2010/wordml" xmlns:w15="http://schemas.microsoft.com/office/word/2012/wordml" xmlns:w16cex="http://schemas.microsoft.com/office/word/2018/wordml/cex" xmlns:w16cid="http://schemas.microsoft.com/office/word/2016/wordml/cid" xmlns:w16="http://schemas.microsoft.com/office/word/2018/wordml" xmlns:w16du="http://schemas.microsoft.com/office/word/2023/wordml/word16du" xmlns:w16sdtdh="http://schemas.microsoft.com/office/word/2020/wordml/sdtdatahash" xmlns:w16sdtfl="http://schemas.microsoft.com/office/word/2024/wordml/sdtformatlock" xmlns:w16se="http://schemas.microsoft.com/office/word/2015/wordml/symex" xmlns:wpg="http://schemas.microsoft.com/office/word/2010/wordprocessingGroup" xmlns:wpi="http://schemas.microsoft.com/office/word/2010/wordprocessingInk" xmlns:wne="http://schemas.microsoft.com/office/word/2006/wordml" xmlns:wps="http://schemas.microsoft.com/office/word/2010/wordprocessingShape" mc:Ignorable="w14 w15 w16se w16cid w16 w16cex w16sdtdh w16sdtfl w16du wp14">
   <w:body>
     <w:tbl>
       <w:tblPr>
@@ -23,12 +23,6 @@
         <w:gridCol w:w="9026"/>
       </w:tblGrid>
       <w:tr>
-        <w:tblPrEx>
-          <w:tblCellMar>
-            <w:top w:w="0" w:type="dxa"/>
-            <w:bottom w:w="0" w:type="dxa"/>
-          </w:tblCellMar>
-        </w:tblPrEx>
         <w:tc>
           <w:tcPr>
             <w:tcW w:w="0" w:type="auto"/>
@@ -64,13 +58,18 @@
             </w:pPr>
           </w:p>
           <w:p>
+            <w:pPr>
+              <w:rPr>
+                <w:lang w:val="en-US"/>
+              </w:rPr>
+            </w:pPr>
             <w:r>
               <w:rPr>
                 <w:color w:val="A7F3D0"/>
                 <w:sz w:val="26"/>
                 <w:szCs w:val="26"/>
               </w:rPr>
-              <w:t>Platform Vision &amp; Technology Strategy Document</w:t>
+              <w:t>Platform Vision</w:t>
             </w:r>
           </w:p>
           <w:p>
@@ -160,12 +159,6 @@
         <w:gridCol w:w="2234"/>
       </w:tblGrid>
       <w:tr>
-        <w:tblPrEx>
-          <w:tblCellMar>
-            <w:top w:w="0" w:type="dxa"/>
-            <w:bottom w:w="0" w:type="dxa"/>
-          </w:tblCellMar>
-        </w:tblPrEx>
         <w:tc>
           <w:tcPr>
             <w:tcW w:w="0" w:type="auto"/>
@@ -435,12 +428,6 @@
         <w:gridCol w:w="9026"/>
       </w:tblGrid>
       <w:tr>
-        <w:tblPrEx>
-          <w:tblCellMar>
-            <w:top w:w="0" w:type="dxa"/>
-            <w:bottom w:w="0" w:type="dxa"/>
-          </w:tblCellMar>
-        </w:tblPrEx>
         <w:tc>
           <w:tcPr>
             <w:tcW w:w="9026" w:type="dxa"/>
@@ -471,12 +458,6 @@
         </w:tc>
       </w:tr>
       <w:tr>
-        <w:tblPrEx>
-          <w:tblCellMar>
-            <w:top w:w="0" w:type="dxa"/>
-            <w:bottom w:w="0" w:type="dxa"/>
-          </w:tblCellMar>
-        </w:tblPrEx>
         <w:tc>
           <w:tcPr>
             <w:tcW w:w="9026" w:type="dxa"/>
@@ -516,12 +497,6 @@
         </w:tc>
       </w:tr>
       <w:tr>
-        <w:tblPrEx>
-          <w:tblCellMar>
-            <w:top w:w="0" w:type="dxa"/>
-            <w:bottom w:w="0" w:type="dxa"/>
-          </w:tblCellMar>
-        </w:tblPrEx>
         <w:tc>
           <w:tcPr>
             <w:tcW w:w="9026" w:type="dxa"/>
@@ -561,12 +536,6 @@
         </w:tc>
       </w:tr>
       <w:tr>
-        <w:tblPrEx>
-          <w:tblCellMar>
-            <w:top w:w="0" w:type="dxa"/>
-            <w:bottom w:w="0" w:type="dxa"/>
-          </w:tblCellMar>
-        </w:tblPrEx>
         <w:tc>
           <w:tcPr>
             <w:tcW w:w="9026" w:type="dxa"/>
@@ -606,12 +575,6 @@
         </w:tc>
       </w:tr>
       <w:tr>
-        <w:tblPrEx>
-          <w:tblCellMar>
-            <w:top w:w="0" w:type="dxa"/>
-            <w:bottom w:w="0" w:type="dxa"/>
-          </w:tblCellMar>
-        </w:tblPrEx>
         <w:tc>
           <w:tcPr>
             <w:tcW w:w="9026" w:type="dxa"/>
@@ -651,12 +614,6 @@
         </w:tc>
       </w:tr>
       <w:tr>
-        <w:tblPrEx>
-          <w:tblCellMar>
-            <w:top w:w="0" w:type="dxa"/>
-            <w:bottom w:w="0" w:type="dxa"/>
-          </w:tblCellMar>
-        </w:tblPrEx>
         <w:tc>
           <w:tcPr>
             <w:tcW w:w="9026" w:type="dxa"/>
@@ -696,12 +653,6 @@
         </w:tc>
       </w:tr>
       <w:tr>
-        <w:tblPrEx>
-          <w:tblCellMar>
-            <w:top w:w="0" w:type="dxa"/>
-            <w:bottom w:w="0" w:type="dxa"/>
-          </w:tblCellMar>
-        </w:tblPrEx>
         <w:tc>
           <w:tcPr>
             <w:tcW w:w="9026" w:type="dxa"/>
@@ -815,12 +766,6 @@
         <w:gridCol w:w="7506"/>
       </w:tblGrid>
       <w:tr>
-        <w:tblPrEx>
-          <w:tblCellMar>
-            <w:top w:w="0" w:type="dxa"/>
-            <w:bottom w:w="0" w:type="dxa"/>
-          </w:tblCellMar>
-        </w:tblPrEx>
         <w:tc>
           <w:tcPr>
             <w:tcW w:w="1520" w:type="dxa"/>
@@ -1111,12 +1056,6 @@
         <w:gridCol w:w="7506"/>
       </w:tblGrid>
       <w:tr>
-        <w:tblPrEx>
-          <w:tblCellMar>
-            <w:top w:w="0" w:type="dxa"/>
-            <w:bottom w:w="0" w:type="dxa"/>
-          </w:tblCellMar>
-        </w:tblPrEx>
         <w:tc>
           <w:tcPr>
             <w:tcW w:w="1520" w:type="dxa"/>
@@ -1370,12 +1309,6 @@
         <w:gridCol w:w="7506"/>
       </w:tblGrid>
       <w:tr>
-        <w:tblPrEx>
-          <w:tblCellMar>
-            <w:top w:w="0" w:type="dxa"/>
-            <w:bottom w:w="0" w:type="dxa"/>
-          </w:tblCellMar>
-        </w:tblPrEx>
         <w:tc>
           <w:tcPr>
             <w:tcW w:w="1520" w:type="dxa"/>
@@ -1666,12 +1599,6 @@
         <w:gridCol w:w="7506"/>
       </w:tblGrid>
       <w:tr>
-        <w:tblPrEx>
-          <w:tblCellMar>
-            <w:top w:w="0" w:type="dxa"/>
-            <w:bottom w:w="0" w:type="dxa"/>
-          </w:tblCellMar>
-        </w:tblPrEx>
         <w:tc>
           <w:tcPr>
             <w:tcW w:w="1520" w:type="dxa"/>
@@ -1942,12 +1869,6 @@
         <w:gridCol w:w="4826"/>
       </w:tblGrid>
       <w:tr>
-        <w:tblPrEx>
-          <w:tblCellMar>
-            <w:top w:w="0" w:type="dxa"/>
-            <w:bottom w:w="0" w:type="dxa"/>
-          </w:tblCellMar>
-        </w:tblPrEx>
         <w:trPr>
           <w:tblHeader/>
         </w:trPr>
@@ -2043,12 +1964,6 @@
         </w:tc>
       </w:tr>
       <w:tr>
-        <w:tblPrEx>
-          <w:tblCellMar>
-            <w:top w:w="0" w:type="dxa"/>
-            <w:bottom w:w="0" w:type="dxa"/>
-          </w:tblCellMar>
-        </w:tblPrEx>
         <w:tc>
           <w:tcPr>
             <w:tcW w:w="1900" w:type="dxa"/>
@@ -2135,12 +2050,6 @@
         </w:tc>
       </w:tr>
       <w:tr>
-        <w:tblPrEx>
-          <w:tblCellMar>
-            <w:top w:w="0" w:type="dxa"/>
-            <w:bottom w:w="0" w:type="dxa"/>
-          </w:tblCellMar>
-        </w:tblPrEx>
         <w:tc>
           <w:tcPr>
             <w:tcW w:w="1900" w:type="dxa"/>
@@ -2227,12 +2136,6 @@
         </w:tc>
       </w:tr>
       <w:tr>
-        <w:tblPrEx>
-          <w:tblCellMar>
-            <w:top w:w="0" w:type="dxa"/>
-            <w:bottom w:w="0" w:type="dxa"/>
-          </w:tblCellMar>
-        </w:tblPrEx>
         <w:tc>
           <w:tcPr>
             <w:tcW w:w="1900" w:type="dxa"/>
@@ -2319,12 +2222,6 @@
         </w:tc>
       </w:tr>
       <w:tr>
-        <w:tblPrEx>
-          <w:tblCellMar>
-            <w:top w:w="0" w:type="dxa"/>
-            <w:bottom w:w="0" w:type="dxa"/>
-          </w:tblCellMar>
-        </w:tblPrEx>
         <w:tc>
           <w:tcPr>
             <w:tcW w:w="1900" w:type="dxa"/>
@@ -2411,12 +2308,6 @@
         </w:tc>
       </w:tr>
       <w:tr>
-        <w:tblPrEx>
-          <w:tblCellMar>
-            <w:top w:w="0" w:type="dxa"/>
-            <w:bottom w:w="0" w:type="dxa"/>
-          </w:tblCellMar>
-        </w:tblPrEx>
         <w:tc>
           <w:tcPr>
             <w:tcW w:w="1900" w:type="dxa"/>
@@ -2503,12 +2394,6 @@
         </w:tc>
       </w:tr>
       <w:tr>
-        <w:tblPrEx>
-          <w:tblCellMar>
-            <w:top w:w="0" w:type="dxa"/>
-            <w:bottom w:w="0" w:type="dxa"/>
-          </w:tblCellMar>
-        </w:tblPrEx>
         <w:tc>
           <w:tcPr>
             <w:tcW w:w="1900" w:type="dxa"/>
@@ -2595,12 +2480,6 @@
         </w:tc>
       </w:tr>
       <w:tr>
-        <w:tblPrEx>
-          <w:tblCellMar>
-            <w:top w:w="0" w:type="dxa"/>
-            <w:bottom w:w="0" w:type="dxa"/>
-          </w:tblCellMar>
-        </w:tblPrEx>
         <w:tc>
           <w:tcPr>
             <w:tcW w:w="1900" w:type="dxa"/>
@@ -2704,7 +2583,7 @@
 </file>
 
 <file path=word/numbering.xml><?xml version="1.0" encoding="utf-8"?>
-<w:numbering xmlns:wpc="http://schemas.microsoft.com/office/word/2010/wordprocessingCanvas" xmlns:cx="http://schemas.microsoft.com/office/drawing/2014/chartex" xmlns:cx1="http://schemas.microsoft.com/office/drawing/2015/9/8/chartex" xmlns:cx2="http://schemas.microsoft.com/office/drawing/2015/10/21/chartex" xmlns:cx3="http://schemas.microsoft.com/office/drawing/2016/5/9/chartex" xmlns:cx4="http://schemas.microsoft.com/office/drawing/2016/5/10/chartex" xmlns:cx5="http://schemas.microsoft.com/office/drawing/2016/5/11/chartex" xmlns:cx6="http://schemas.microsoft.com/office/drawing/2016/5/12/chartex" xmlns:cx7="http://schemas.microsoft.com/office/drawing/2016/5/13/chartex" xmlns:cx8="http://schemas.microsoft.com/office/drawing/2016/5/14/chartex" xmlns:mc="http://schemas.openxmlformats.org/markup-compatibility/2006" xmlns:aink="http://schemas.microsoft.com/office/drawing/2016/ink" xmlns:am3d="http://schemas.microsoft.com/office/drawing/2017/model3d" xmlns:o="urn:schemas-microsoft-com:office:office" xmlns:oel="http://schemas.microsoft.com/office/2019/extlst" xmlns:r="http://schemas.openxmlformats.org/officeDocument/2006/relationships" xmlns:m="http://schemas.openxmlformats.org/officeDocument/2006/math" xmlns:v="urn:schemas-microsoft-com:vml" xmlns:wp14="http://schemas.microsoft.com/office/word/2010/wordprocessingDrawing" xmlns:wp="http://schemas.openxmlformats.org/drawingml/2006/wordprocessingDrawing" xmlns:w10="urn:schemas-microsoft-com:office:word" xmlns:w="http://schemas.openxmlformats.org/wordprocessingml/2006/main" xmlns:w14="http://schemas.microsoft.com/office/word/2010/wordml" xmlns:w15="http://schemas.microsoft.com/office/word/2012/wordml" xmlns:w16cei="http://schemas.microsoft.com/office/word/2026/wordml/cei" xmlns:w16cex="http://schemas.microsoft.com/office/word/2018/wordml/cex" xmlns:w16cid="http://schemas.microsoft.com/office/word/2016/wordml/cid" xmlns:w16="http://schemas.microsoft.com/office/word/2018/wordml" xmlns:w16du="http://schemas.microsoft.com/office/word/2023/wordml/word16du" xmlns:w16sdtdh="http://schemas.microsoft.com/office/word/2020/wordml/sdtdatahash" xmlns:w16sdtfl="http://schemas.microsoft.com/office/word/2024/wordml/sdtformatlock" xmlns:w16se="http://schemas.microsoft.com/office/word/2015/wordml/symex" xmlns:wpg="http://schemas.microsoft.com/office/word/2010/wordprocessingGroup" xmlns:wpi="http://schemas.microsoft.com/office/word/2010/wordprocessingInk" xmlns:wne="http://schemas.microsoft.com/office/word/2006/wordml" xmlns:wps="http://schemas.microsoft.com/office/word/2010/wordprocessingShape" mc:Ignorable="w14 w15 w16se w16cid w16 w16cex w16sdtdh w16sdtfl w16du wp14">
+<w:numbering xmlns:wpc="http://schemas.microsoft.com/office/word/2010/wordprocessingCanvas" xmlns:cx="http://schemas.microsoft.com/office/drawing/2014/chartex" xmlns:cx1="http://schemas.microsoft.com/office/drawing/2015/9/8/chartex" xmlns:cx2="http://schemas.microsoft.com/office/drawing/2015/10/21/chartex" xmlns:cx3="http://schemas.microsoft.com/office/drawing/2016/5/9/chartex" xmlns:cx4="http://schemas.microsoft.com/office/drawing/2016/5/10/chartex" xmlns:cx5="http://schemas.microsoft.com/office/drawing/2016/5/11/chartex" xmlns:cx6="http://schemas.microsoft.com/office/drawing/2016/5/12/chartex" xmlns:cx7="http://schemas.microsoft.com/office/drawing/2016/5/13/chartex" xmlns:cx8="http://schemas.microsoft.com/office/drawing/2016/5/14/chartex" xmlns:mc="http://schemas.openxmlformats.org/markup-compatibility/2006" xmlns:aink="http://schemas.microsoft.com/office/drawing/2016/ink" xmlns:am3d="http://schemas.microsoft.com/office/drawing/2017/model3d" xmlns:o="urn:schemas-microsoft-com:office:office" xmlns:oel="http://schemas.microsoft.com/office/2019/extlst" xmlns:r="http://schemas.openxmlformats.org/officeDocument/2006/relationships" xmlns:m="http://schemas.openxmlformats.org/officeDocument/2006/math" xmlns:v="urn:schemas-microsoft-com:vml" xmlns:wp14="http://schemas.microsoft.com/office/word/2010/wordprocessingDrawing" xmlns:wp="http://schemas.openxmlformats.org/drawingml/2006/wordprocessingDrawing" xmlns:w10="urn:schemas-microsoft-com:office:word" xmlns:w="http://schemas.openxmlformats.org/wordprocessingml/2006/main" xmlns:w14="http://schemas.microsoft.com/office/word/2010/wordml" xmlns:w15="http://schemas.microsoft.com/office/word/2012/wordml" xmlns:w16cex="http://schemas.microsoft.com/office/word/2018/wordml/cex" xmlns:w16cid="http://schemas.microsoft.com/office/word/2016/wordml/cid" xmlns:w16="http://schemas.microsoft.com/office/word/2018/wordml" xmlns:w16du="http://schemas.microsoft.com/office/word/2023/wordml/word16du" xmlns:w16sdtdh="http://schemas.microsoft.com/office/word/2020/wordml/sdtdatahash" xmlns:w16sdtfl="http://schemas.microsoft.com/office/word/2024/wordml/sdtformatlock" xmlns:w16se="http://schemas.microsoft.com/office/word/2015/wordml/symex" xmlns:wpg="http://schemas.microsoft.com/office/word/2010/wordprocessingGroup" xmlns:wpi="http://schemas.microsoft.com/office/word/2010/wordprocessingInk" xmlns:wne="http://schemas.microsoft.com/office/word/2006/wordml" xmlns:wps="http://schemas.microsoft.com/office/word/2010/wordprocessingShape" mc:Ignorable="w14 w15 w16se w16cid w16 w16cex w16sdtdh w16sdtfl w16du wp14">
   <w:abstractNum w:abstractNumId="0" w15:restartNumberingAfterBreak="0">
     <w:nsid w:val="15713725"/>
     <w:multiLevelType w:val="hybridMultilevel"/>
@@ -3181,7 +3060,6 @@
       <w:kern w:val="0"/>
       <w:sz w:val="21"/>
       <w:szCs w:val="21"/>
-      <w:lang/>
       <w14:ligatures w14:val="none"/>
     </w:rPr>
   </w:style>

</xml_diff>